<commit_message>
Update dataset website layout and assets
</commit_message>
<xml_diff>
--- a/dist/assets/TopoStrawberry_Dataset_Access_Application.docx
+++ b/dist/assets/TopoStrawberry_Dataset_Access_Application.docx
@@ -11,6 +11,8 @@
           <w:lang w:val="en-US" w:eastAsia="zh-CN"/>
         </w:rPr>
       </w:pPr>
+      <w:bookmarkStart w:id="0" w:name="_GoBack"/>
+      <w:bookmarkEnd w:id="0"/>
       <w:r>
         <w:rPr>
           <w:rFonts w:hint="eastAsia" w:ascii="Times New Roman" w:hAnsi="Times New Roman" w:eastAsia="宋体" w:cs="Times New Roman"/>
@@ -1197,7 +1199,7 @@
             </w14:solidFill>
           </w14:textFill>
         </w:rPr>
-        <w:t xml:space="preserve">Dataset license: CC BY-NC 4.0.</w:t>
+        <w:t>Dataset license: CC BY-NC 4.0.</w:t>
       </w:r>
       <w:r>
         <w:rPr>
@@ -1218,7 +1220,7 @@
           </w14:textFill>
         </w:rPr>
         <w:t>
-        </w:t>
+</w:t>
       </w:r>
       <w:r>
         <w:rPr>
@@ -1238,7 +1240,7 @@
           </w14:textFill>
         </w:rPr>
         <w:t>
-        </w:t>
+</w:t>
       </w:r>
       <w:r>
         <w:rPr>
@@ -1279,7 +1281,7 @@
           </w14:textFill>
         </w:rPr>
         <w:t>
-        </w:t>
+</w:t>
       </w:r>
     </w:p>
     <w:p>
@@ -1397,17 +1399,7 @@
           <w:sz w:val="24"/>
           <w:szCs w:val="24"/>
         </w:rPr>
-        <w:t>Access is granted only to</w:t>
-      </w:r>
-      <w:bookmarkStart w:id="0" w:name="_GoBack"/>
-      <w:bookmarkEnd w:id="0"/>
-      <w:r>
-        <w:rPr>
-          <w:rFonts w:hint="default" w:ascii="Times New Roman" w:hAnsi="Times New Roman" w:cs="Times New Roman"/>
-          <w:sz w:val="24"/>
-          <w:szCs w:val="24"/>
-        </w:rPr>
-        <w:t xml:space="preserve"> the applicant. Other researchers who require direct access should submit a separate application. The </w:t>
+        <w:t xml:space="preserve">Access is granted only to the applicant. Other researchers who require direct access should submit a separate application. The </w:t>
       </w:r>
       <w:r>
         <w:rPr>
@@ -2418,13 +2410,24 @@
     </w:pPr>
     <w:r>
       <w:rPr>
+        <w:rFonts w:hint="eastAsia" w:eastAsia="宋体"/>
+        <w:b w:val="0"/>
+        <w:i w:val="0"/>
+        <w:color w:val="667085"/>
+        <w:sz w:val="16"/>
+        <w:lang w:val="en-US" w:eastAsia="zh-CN"/>
+      </w:rPr>
+      <w:t>Topo</w:t>
+    </w:r>
+    <w:r>
+      <w:rPr>
         <w:rFonts w:ascii="Aptos" w:hAnsi="Aptos"/>
         <w:b w:val="0"/>
         <w:i w:val="0"/>
         <w:color w:val="667085"/>
         <w:sz w:val="16"/>
       </w:rPr>
-      <w:t xml:space="preserve">StrawberryHarvest-RGBD   |   Page </w:t>
+      <w:t xml:space="preserve">Strawberry   |   Page </w:t>
     </w:r>
     <w:r>
       <w:fldChar w:fldCharType="begin"/>

</xml_diff>

<commit_message>
Update dataset website, annotation protocol, and access form
</commit_message>
<xml_diff>
--- a/dist/assets/TopoStrawberry_Dataset_Access_Application.docx
+++ b/dist/assets/TopoStrawberry_Dataset_Access_Application.docx
@@ -7,22 +7,20 @@
         <w:spacing w:after="40"/>
         <w:jc w:val="center"/>
         <w:rPr>
-          <w:rFonts w:hint="default" w:ascii="Times New Roman" w:hAnsi="Times New Roman" w:eastAsia="宋体" w:cs="Times New Roman"/>
+          <w:rFonts w:hint="default" w:ascii="Times New Roman" w:hAnsi="Times New Roman" w:eastAsia="SimSun" w:cs="Times New Roman"/>
           <w:lang w:val="en-US" w:eastAsia="zh-CN"/>
         </w:rPr>
       </w:pPr>
-      <w:bookmarkStart w:id="0" w:name="_GoBack"/>
-      <w:bookmarkEnd w:id="0"/>
       <w:r>
         <w:rPr>
-          <w:rFonts w:hint="eastAsia" w:ascii="Times New Roman" w:hAnsi="Times New Roman" w:eastAsia="宋体" w:cs="Times New Roman"/>
+          <w:rFonts w:hint="eastAsia" w:ascii="Times New Roman" w:hAnsi="Times New Roman" w:eastAsia="SimSun" w:cs="Times New Roman"/>
           <w:b/>
           <w:i w:val="0"/>
           <w:color w:val="2E75B6"/>
           <w:sz w:val="24"/>
           <w:lang w:val="en-US" w:eastAsia="zh-CN"/>
         </w:rPr>
-        <w:t>Topo</w:t>
+        <w:t>ToPoStrawberry-RGBD</w:t>
       </w:r>
       <w:r>
         <w:rPr>
@@ -32,18 +30,18 @@
           <w:color w:val="2E75B6"/>
           <w:sz w:val="24"/>
         </w:rPr>
-        <w:t>S</w:t>
+        <w:t/>
       </w:r>
       <w:r>
         <w:rPr>
-          <w:rFonts w:hint="eastAsia" w:ascii="Times New Roman" w:hAnsi="Times New Roman" w:eastAsia="宋体" w:cs="Times New Roman"/>
+          <w:rFonts w:hint="eastAsia" w:ascii="Times New Roman" w:hAnsi="Times New Roman" w:eastAsia="SimSun" w:cs="Times New Roman"/>
           <w:b/>
           <w:i w:val="0"/>
           <w:color w:val="2E75B6"/>
           <w:sz w:val="24"/>
           <w:lang w:val="en-US" w:eastAsia="zh-CN"/>
         </w:rPr>
-        <w:t>trawberry Dataset</w:t>
+        <w:t> Dataset</w:t>
       </w:r>
     </w:p>
     <w:p>
@@ -163,7 +161,7 @@
             </w:r>
             <w:r>
               <w:rPr>
-                <w:rFonts w:hint="eastAsia" w:ascii="Times New Roman" w:hAnsi="Times New Roman" w:eastAsia="宋体" w:cs="Times New Roman"/>
+                <w:rFonts w:hint="eastAsia" w:ascii="Times New Roman" w:hAnsi="Times New Roman" w:eastAsia="SimSun" w:cs="Times New Roman"/>
                 <w:b w:val="0"/>
                 <w:i w:val="0"/>
                 <w:color w:val="24527A"/>
@@ -209,7 +207,7 @@
             </w:r>
             <w:r>
               <w:rPr>
-                <w:rFonts w:hint="eastAsia" w:ascii="Times New Roman" w:hAnsi="Times New Roman" w:eastAsia="宋体" w:cs="Times New Roman"/>
+                <w:rFonts w:hint="eastAsia" w:ascii="Times New Roman" w:hAnsi="Times New Roman" w:eastAsia="SimSun" w:cs="Times New Roman"/>
                 <w:b w:val="0"/>
                 <w:i w:val="0"/>
                 <w:color w:val="24527A"/>
@@ -400,7 +398,7 @@
             </w:pPr>
             <w:r>
               <w:rPr>
-                <w:rFonts w:hint="default" w:ascii="Times New Roman" w:hAnsi="Times New Roman" w:eastAsia="宋体" w:cs="Times New Roman"/>
+                <w:rFonts w:hint="default" w:ascii="Times New Roman" w:hAnsi="Times New Roman" w:eastAsia="SimSun" w:cs="Times New Roman"/>
                 <w:b/>
                 <w:i w:val="0"/>
                 <w:color w:val="1F2937"/>
@@ -823,7 +821,7 @@
       </w:r>
       <w:r>
         <w:rPr>
-          <w:rFonts w:hint="eastAsia" w:ascii="Times New Roman" w:hAnsi="Times New Roman" w:eastAsia="宋体" w:cs="Times New Roman"/>
+          <w:rFonts w:hint="eastAsia" w:ascii="Times New Roman" w:hAnsi="Times New Roman" w:eastAsia="SimSun" w:cs="Times New Roman"/>
           <w:b/>
           <w:i w:val="0"/>
           <w:color w:val="1F2937"/>
@@ -875,7 +873,7 @@
       </w:r>
       <w:r>
         <w:rPr>
-          <w:rFonts w:hint="eastAsia" w:ascii="Times New Roman" w:hAnsi="Times New Roman" w:eastAsia="宋体" w:cs="Times New Roman"/>
+          <w:rFonts w:hint="eastAsia" w:ascii="Times New Roman" w:hAnsi="Times New Roman" w:eastAsia="SimSun" w:cs="Times New Roman"/>
           <w:b w:val="0"/>
           <w:i w:val="0"/>
           <w:color w:val="262626" w:themeColor="text1" w:themeTint="D9"/>
@@ -891,7 +889,7 @@
             </w14:solidFill>
           </w14:textFill>
         </w:rPr>
-        <w:t>Topo</w:t>
+        <w:t>ToPoStrawberry-RGBD</w:t>
       </w:r>
       <w:r>
         <w:rPr>
@@ -910,11 +908,11 @@
             </w14:solidFill>
           </w14:textFill>
         </w:rPr>
-        <w:t>Strawberry</w:t>
+        <w:t/>
       </w:r>
       <w:r>
         <w:rPr>
-          <w:rFonts w:hint="eastAsia" w:ascii="Times New Roman" w:hAnsi="Times New Roman" w:eastAsia="宋体" w:cs="Times New Roman"/>
+          <w:rFonts w:hint="eastAsia" w:ascii="Times New Roman" w:hAnsi="Times New Roman" w:eastAsia="SimSun" w:cs="Times New Roman"/>
           <w:b w:val="0"/>
           <w:i w:val="0"/>
           <w:color w:val="262626" w:themeColor="text1" w:themeTint="D9"/>
@@ -930,7 +928,7 @@
             </w14:solidFill>
           </w14:textFill>
         </w:rPr>
-        <w:t xml:space="preserve"> dataset</w:t>
+        <w:t> dataset</w:t>
       </w:r>
       <w:r>
         <w:rPr>
@@ -1087,7 +1085,7 @@
       </w:r>
       <w:r>
         <w:rPr>
-          <w:rFonts w:hint="eastAsia" w:ascii="Times New Roman" w:hAnsi="Times New Roman" w:eastAsia="宋体" w:cs="Times New Roman"/>
+          <w:rFonts w:hint="eastAsia" w:ascii="Times New Roman" w:hAnsi="Times New Roman" w:eastAsia="SimSun" w:cs="Times New Roman"/>
           <w:b w:val="0"/>
           <w:i/>
           <w:color w:val="262626" w:themeColor="text1" w:themeTint="D9"/>
@@ -1103,7 +1101,7 @@
             </w14:solidFill>
           </w14:textFill>
         </w:rPr>
-        <w:t>Topo</w:t>
+        <w:t>ToPoStrawberry-RGBD</w:t>
       </w:r>
       <w:r>
         <w:rPr>
@@ -1122,11 +1120,11 @@
             </w14:solidFill>
           </w14:textFill>
         </w:rPr>
-        <w:t>Strawberry</w:t>
+        <w:t/>
       </w:r>
       <w:r>
         <w:rPr>
-          <w:rFonts w:hint="eastAsia" w:ascii="Times New Roman" w:hAnsi="Times New Roman" w:eastAsia="宋体" w:cs="Times New Roman"/>
+          <w:rFonts w:hint="eastAsia" w:ascii="Times New Roman" w:hAnsi="Times New Roman" w:eastAsia="SimSun" w:cs="Times New Roman"/>
           <w:b w:val="0"/>
           <w:i/>
           <w:color w:val="262626" w:themeColor="text1" w:themeTint="D9"/>
@@ -1203,7 +1201,7 @@
       </w:r>
       <w:r>
         <w:rPr>
-          <w:rFonts w:hint="eastAsia" w:ascii="Times New Roman" w:hAnsi="Times New Roman" w:eastAsia="宋体" w:cs="Times New Roman"/>
+          <w:rFonts w:hint="eastAsia" w:ascii="Times New Roman" w:hAnsi="Times New Roman" w:eastAsia="SimSun" w:cs="Times New Roman"/>
           <w:b w:val="0"/>
           <w:i/>
           <w:color w:val="262626" w:themeColor="text1" w:themeTint="D9"/>
@@ -1244,7 +1242,7 @@
       </w:r>
       <w:r>
         <w:rPr>
-          <w:rFonts w:hint="eastAsia" w:ascii="Times New Roman" w:hAnsi="Times New Roman" w:eastAsia="宋体" w:cs="Times New Roman"/>
+          <w:rFonts w:hint="eastAsia" w:ascii="Times New Roman" w:hAnsi="Times New Roman" w:eastAsia="SimSun" w:cs="Times New Roman"/>
           <w:b w:val="0"/>
           <w:i/>
           <w:color w:val="262626" w:themeColor="text1" w:themeTint="D9"/>
@@ -1331,7 +1329,7 @@
       </w:r>
       <w:r>
         <w:rPr>
-          <w:rFonts w:hint="eastAsia" w:ascii="Times New Roman" w:hAnsi="Times New Roman" w:eastAsia="宋体" w:cs="Times New Roman"/>
+          <w:rFonts w:hint="eastAsia" w:ascii="Times New Roman" w:hAnsi="Times New Roman" w:eastAsia="SimSun" w:cs="Times New Roman"/>
           <w:sz w:val="24"/>
           <w:szCs w:val="24"/>
           <w:lang w:val="en-US" w:eastAsia="zh-CN"/>
@@ -1403,7 +1401,7 @@
       </w:r>
       <w:r>
         <w:rPr>
-          <w:rFonts w:hint="eastAsia" w:ascii="Times New Roman" w:hAnsi="Times New Roman" w:eastAsia="宋体" w:cs="Times New Roman"/>
+          <w:rFonts w:hint="eastAsia" w:ascii="Times New Roman" w:hAnsi="Times New Roman" w:eastAsia="SimSun" w:cs="Times New Roman"/>
           <w:sz w:val="24"/>
           <w:szCs w:val="24"/>
           <w:lang w:val="en-US" w:eastAsia="zh-CN"/>
@@ -1475,7 +1473,7 @@
       </w:r>
       <w:r>
         <w:rPr>
-          <w:rFonts w:hint="eastAsia" w:ascii="Times New Roman" w:hAnsi="Times New Roman" w:eastAsia="宋体" w:cs="Times New Roman"/>
+          <w:rFonts w:hint="eastAsia" w:ascii="Times New Roman" w:hAnsi="Times New Roman" w:eastAsia="SimSun" w:cs="Times New Roman"/>
           <w:sz w:val="24"/>
           <w:szCs w:val="24"/>
           <w:lang w:val="en-US" w:eastAsia="zh-CN"/>
@@ -1492,12 +1490,12 @@
       </w:r>
       <w:r>
         <w:rPr>
-          <w:rFonts w:hint="eastAsia" w:ascii="Times New Roman" w:hAnsi="Times New Roman" w:eastAsia="宋体" w:cs="Times New Roman"/>
+          <w:rFonts w:hint="eastAsia" w:ascii="Times New Roman" w:hAnsi="Times New Roman" w:eastAsia="SimSun" w:cs="Times New Roman"/>
           <w:sz w:val="24"/>
           <w:szCs w:val="24"/>
           <w:lang w:val="en-US" w:eastAsia="zh-CN"/>
         </w:rPr>
-        <w:t>Topo</w:t>
+        <w:t>ToPoStrawberry-RGBD</w:t>
       </w:r>
       <w:r>
         <w:rPr>
@@ -1505,16 +1503,16 @@
           <w:sz w:val="24"/>
           <w:szCs w:val="24"/>
         </w:rPr>
-        <w:t>Strawberry</w:t>
+        <w:t/>
       </w:r>
       <w:r>
         <w:rPr>
-          <w:rFonts w:hint="eastAsia" w:ascii="Times New Roman" w:hAnsi="Times New Roman" w:eastAsia="宋体" w:cs="Times New Roman"/>
+          <w:rFonts w:hint="eastAsia" w:ascii="Times New Roman" w:hAnsi="Times New Roman" w:eastAsia="SimSun" w:cs="Times New Roman"/>
           <w:sz w:val="24"/>
           <w:szCs w:val="24"/>
           <w:lang w:val="en-US" w:eastAsia="zh-CN"/>
         </w:rPr>
-        <w:t xml:space="preserve"> dataset</w:t>
+        <w:t> dataset</w:t>
       </w:r>
       <w:r>
         <w:rPr>
@@ -1526,7 +1524,7 @@
       </w:r>
       <w:r>
         <w:rPr>
-          <w:rFonts w:hint="eastAsia" w:ascii="Times New Roman" w:hAnsi="Times New Roman" w:eastAsia="宋体" w:cs="Times New Roman"/>
+          <w:rFonts w:hint="eastAsia" w:ascii="Times New Roman" w:hAnsi="Times New Roman" w:eastAsia="SimSun" w:cs="Times New Roman"/>
           <w:sz w:val="24"/>
           <w:szCs w:val="24"/>
           <w:lang w:val="en-US" w:eastAsia="zh-CN"/>
@@ -1598,7 +1596,7 @@
       </w:r>
       <w:r>
         <w:rPr>
-          <w:rFonts w:hint="eastAsia" w:ascii="Times New Roman" w:hAnsi="Times New Roman" w:eastAsia="宋体" w:cs="Times New Roman"/>
+          <w:rFonts w:hint="eastAsia" w:ascii="Times New Roman" w:hAnsi="Times New Roman" w:eastAsia="SimSun" w:cs="Times New Roman"/>
           <w:sz w:val="24"/>
           <w:szCs w:val="24"/>
           <w:lang w:val="en-US" w:eastAsia="zh-CN"/>
@@ -1670,7 +1668,7 @@
       </w:r>
       <w:r>
         <w:rPr>
-          <w:rFonts w:hint="eastAsia" w:ascii="Times New Roman" w:hAnsi="Times New Roman" w:eastAsia="宋体" w:cs="Times New Roman"/>
+          <w:rFonts w:hint="eastAsia" w:ascii="Times New Roman" w:hAnsi="Times New Roman" w:eastAsia="SimSun" w:cs="Times New Roman"/>
           <w:sz w:val="24"/>
           <w:szCs w:val="24"/>
           <w:lang w:val="en-US" w:eastAsia="zh-CN"/>
@@ -1718,14 +1716,6 @@
         <w:gridCol w:w="10152"/>
       </w:tblGrid>
       <w:tr>
-        <w:tblPrEx>
-          <w:tblCellMar>
-            <w:top w:w="0" w:type="dxa"/>
-            <w:left w:w="108" w:type="dxa"/>
-            <w:bottom w:w="0" w:type="dxa"/>
-            <w:right w:w="108" w:type="dxa"/>
-          </w:tblCellMar>
-        </w:tblPrEx>
         <w:trPr>
           <w:jc w:val="center"/>
         </w:trPr>
@@ -1761,7 +1751,7 @@
             </w:r>
             <w:r>
               <w:rPr>
-                <w:rFonts w:hint="eastAsia" w:ascii="Times New Roman" w:hAnsi="Times New Roman" w:eastAsia="宋体" w:cs="Times New Roman"/>
+                <w:rFonts w:hint="eastAsia" w:ascii="Times New Roman" w:hAnsi="Times New Roman" w:eastAsia="SimSun" w:cs="Times New Roman"/>
                 <w:b w:val="0"/>
                 <w:i w:val="0"/>
                 <w:color w:val="1F2937"/>
@@ -1771,6 +1761,8 @@
               </w:rPr>
               <w:t xml:space="preserve"> </w:t>
             </w:r>
+            <w:bookmarkStart w:id="0" w:name="_GoBack"/>
+            <w:bookmarkEnd w:id="0"/>
             <w:r>
               <w:rPr>
                 <w:rFonts w:hint="default" w:ascii="Times New Roman" w:hAnsi="Times New Roman" w:cs="Times New Roman"/>
@@ -1829,7 +1821,7 @@
             </w:r>
             <w:r>
               <w:rPr>
-                <w:rFonts w:hint="eastAsia" w:ascii="Times New Roman" w:hAnsi="Times New Roman" w:eastAsia="宋体" w:cs="Times New Roman"/>
+                <w:rFonts w:hint="eastAsia" w:ascii="Times New Roman" w:hAnsi="Times New Roman" w:eastAsia="SimSun" w:cs="Times New Roman"/>
                 <w:b w:val="0"/>
                 <w:i w:val="0"/>
                 <w:color w:val="1F2937"/>
@@ -1900,7 +1892,7 @@
             </w:r>
             <w:r>
               <w:rPr>
-                <w:rFonts w:hint="eastAsia" w:ascii="Times New Roman" w:hAnsi="Times New Roman" w:eastAsia="宋体" w:cs="Times New Roman"/>
+                <w:rFonts w:hint="eastAsia" w:ascii="Times New Roman" w:hAnsi="Times New Roman" w:eastAsia="SimSun" w:cs="Times New Roman"/>
                 <w:b w:val="0"/>
                 <w:i w:val="0"/>
                 <w:color w:val="1F2937"/>
@@ -1923,7 +1915,7 @@
             </w:r>
             <w:r>
               <w:rPr>
-                <w:rFonts w:hint="eastAsia" w:ascii="Times New Roman" w:hAnsi="Times New Roman" w:eastAsia="宋体" w:cs="Times New Roman"/>
+                <w:rFonts w:hint="eastAsia" w:ascii="Times New Roman" w:hAnsi="Times New Roman" w:eastAsia="SimSun" w:cs="Times New Roman"/>
                 <w:b w:val="0"/>
                 <w:i w:val="0"/>
                 <w:color w:val="1F2937"/>
@@ -1983,12 +1975,6 @@
             <w:insideH w:val="single" w:color="auto" w:sz="4" w:space="0"/>
             <w:insideV w:val="single" w:color="auto" w:sz="4" w:space="0"/>
           </w:tblBorders>
-          <w:tblCellMar>
-            <w:top w:w="0" w:type="dxa"/>
-            <w:left w:w="108" w:type="dxa"/>
-            <w:bottom w:w="0" w:type="dxa"/>
-            <w:right w:w="108" w:type="dxa"/>
-          </w:tblCellMar>
         </w:tblPrEx>
         <w:trPr>
           <w:cantSplit/>
@@ -2017,7 +2003,7 @@
             <w:pPr>
               <w:spacing w:after="0"/>
               <w:rPr>
-                <w:rFonts w:hint="eastAsia" w:ascii="Times New Roman" w:hAnsi="Times New Roman" w:eastAsia="宋体" w:cs="Times New Roman"/>
+                <w:rFonts w:hint="eastAsia" w:ascii="Times New Roman" w:hAnsi="Times New Roman" w:eastAsia="SimSun" w:cs="Times New Roman"/>
                 <w:b/>
                 <w:bCs/>
                 <w:color w:val="000000"/>
@@ -2040,7 +2026,7 @@
             </w:r>
             <w:r>
               <w:rPr>
-                <w:rFonts w:hint="eastAsia" w:ascii="Times New Roman" w:hAnsi="Times New Roman" w:eastAsia="宋体" w:cs="Times New Roman"/>
+                <w:rFonts w:hint="eastAsia" w:ascii="Times New Roman" w:hAnsi="Times New Roman" w:eastAsia="SimSun" w:cs="Times New Roman"/>
                 <w:b/>
                 <w:bCs/>
                 <w:i w:val="0"/>
@@ -2075,7 +2061,7 @@
             <w:pPr>
               <w:spacing w:after="0"/>
               <w:rPr>
-                <w:rFonts w:hint="eastAsia" w:ascii="Times New Roman" w:hAnsi="Times New Roman" w:eastAsia="宋体" w:cs="Times New Roman"/>
+                <w:rFonts w:hint="eastAsia" w:ascii="Times New Roman" w:hAnsi="Times New Roman" w:eastAsia="SimSun" w:cs="Times New Roman"/>
                 <w:b/>
                 <w:bCs/>
                 <w:color w:val="000000"/>
@@ -2098,7 +2084,7 @@
             </w:r>
             <w:r>
               <w:rPr>
-                <w:rFonts w:hint="eastAsia" w:ascii="Times New Roman" w:hAnsi="Times New Roman" w:eastAsia="宋体" w:cs="Times New Roman"/>
+                <w:rFonts w:hint="eastAsia" w:ascii="Times New Roman" w:hAnsi="Times New Roman" w:eastAsia="SimSun" w:cs="Times New Roman"/>
                 <w:b/>
                 <w:bCs/>
                 <w:i w:val="0"/>
@@ -2156,7 +2142,7 @@
             <w:pPr>
               <w:spacing w:after="0"/>
               <w:rPr>
-                <w:rFonts w:hint="eastAsia" w:ascii="Times New Roman" w:hAnsi="Times New Roman" w:eastAsia="宋体" w:cs="Times New Roman"/>
+                <w:rFonts w:hint="eastAsia" w:ascii="Times New Roman" w:hAnsi="Times New Roman" w:eastAsia="SimSun" w:cs="Times New Roman"/>
                 <w:b/>
                 <w:bCs/>
                 <w:color w:val="000000"/>
@@ -2179,7 +2165,7 @@
             </w:r>
             <w:r>
               <w:rPr>
-                <w:rFonts w:hint="eastAsia" w:ascii="Times New Roman" w:hAnsi="Times New Roman" w:eastAsia="宋体" w:cs="Times New Roman"/>
+                <w:rFonts w:hint="eastAsia" w:ascii="Times New Roman" w:hAnsi="Times New Roman" w:eastAsia="SimSun" w:cs="Times New Roman"/>
                 <w:b/>
                 <w:bCs/>
                 <w:i w:val="0"/>
@@ -2214,7 +2200,7 @@
       </w:pPr>
       <w:r>
         <w:rPr>
-          <w:rFonts w:hint="eastAsia" w:ascii="Times New Roman" w:hAnsi="Times New Roman" w:eastAsia="宋体" w:cs="Times New Roman"/>
+          <w:rFonts w:hint="eastAsia" w:ascii="Times New Roman" w:hAnsi="Times New Roman" w:eastAsia="SimSun" w:cs="Times New Roman"/>
           <w:b w:val="0"/>
           <w:i/>
           <w:color w:val="262626" w:themeColor="text1" w:themeTint="D9"/>
@@ -2286,12 +2272,6 @@
             <w:insideH w:val="single" w:color="auto" w:sz="4" w:space="0"/>
             <w:insideV w:val="single" w:color="auto" w:sz="4" w:space="0"/>
           </w:tblBorders>
-          <w:tblCellMar>
-            <w:top w:w="0" w:type="dxa"/>
-            <w:left w:w="108" w:type="dxa"/>
-            <w:bottom w:w="0" w:type="dxa"/>
-            <w:right w:w="108" w:type="dxa"/>
-          </w:tblCellMar>
         </w:tblPrEx>
         <w:trPr>
           <w:jc w:val="center"/>
@@ -2329,7 +2309,7 @@
             </w:r>
             <w:r>
               <w:rPr>
-                <w:rFonts w:hint="eastAsia" w:ascii="Times New Roman" w:hAnsi="Times New Roman" w:eastAsia="宋体" w:cs="Times New Roman"/>
+                <w:rFonts w:hint="eastAsia" w:ascii="Times New Roman" w:hAnsi="Times New Roman" w:eastAsia="SimSun" w:cs="Times New Roman"/>
                 <w:b w:val="0"/>
                 <w:bCs/>
                 <w:i/>
@@ -2410,14 +2390,14 @@
     </w:pPr>
     <w:r>
       <w:rPr>
-        <w:rFonts w:hint="eastAsia" w:eastAsia="宋体"/>
+        <w:rFonts w:hint="eastAsia" w:eastAsia="SimSun"/>
         <w:b w:val="0"/>
         <w:i w:val="0"/>
         <w:color w:val="667085"/>
         <w:sz w:val="16"/>
         <w:lang w:val="en-US" w:eastAsia="zh-CN"/>
       </w:rPr>
-      <w:t>Topo</w:t>
+      <w:t>ToPoStrawberry-RGBD</w:t>
     </w:r>
     <w:r>
       <w:rPr>
@@ -2427,7 +2407,7 @@
         <w:color w:val="667085"/>
         <w:sz w:val="16"/>
       </w:rPr>
-      <w:t xml:space="preserve">Strawberry   |   Page </w:t>
+      <w:t xml:space="preserve">   |   Page </w:t>
     </w:r>
     <w:r>
       <w:fldChar w:fldCharType="begin"/>
@@ -2643,7 +2623,7 @@
   <w:docDefaults>
     <w:rPrDefault>
       <w:rPr>
-        <w:rFonts w:ascii="Times New Roman" w:hAnsi="Times New Roman" w:eastAsia="宋体" w:cs="Times New Roman"/>
+        <w:rFonts w:ascii="Times New Roman" w:hAnsi="Times New Roman" w:eastAsia="SimSun" w:cs="Times New Roman"/>
       </w:rPr>
     </w:rPrDefault>
     <w:pPrDefault/>
@@ -2719,7 +2699,7 @@
     <w:lsdException w:uiPriority="99" w:name="Body Text Indent"/>
     <w:lsdException w:qFormat="1" w:uiPriority="99" w:semiHidden="0" w:name="List Continue"/>
     <w:lsdException w:qFormat="1" w:uiPriority="99" w:semiHidden="0" w:name="List Continue 2"/>
-    <w:lsdException w:uiPriority="99" w:semiHidden="0" w:name="List Continue 3"/>
+    <w:lsdException w:qFormat="1" w:uiPriority="99" w:semiHidden="0" w:name="List Continue 3"/>
     <w:lsdException w:uiPriority="99" w:name="List Continue 4"/>
     <w:lsdException w:uiPriority="99" w:name="List Continue 5"/>
     <w:lsdException w:uiPriority="99" w:name="Message Header"/>
@@ -3452,6 +3432,7 @@
     <w:name w:val="List Continue 3"/>
     <w:basedOn w:val="1"/>
     <w:unhideWhenUsed/>
+    <w:qFormat/>
     <w:uiPriority w:val="99"/>
     <w:pPr>
       <w:spacing w:after="120"/>

</xml_diff>

<commit_message>
Fix dataset name and preserve spaces in access application
</commit_message>
<xml_diff>
--- a/dist/assets/TopoStrawberry_Dataset_Access_Application.docx
+++ b/dist/assets/TopoStrawberry_Dataset_Access_Application.docx
@@ -20,7 +20,7 @@
           <w:sz w:val="24"/>
           <w:lang w:val="en-US" w:eastAsia="zh-CN"/>
         </w:rPr>
-        <w:t>ToPoStrawberry-RGBD</w:t>
+        <w:t>TopoStrawberry-RGBD dataset</w:t>
       </w:r>
       <w:r>
         <w:rPr>
@@ -41,7 +41,7 @@
           <w:sz w:val="24"/>
           <w:lang w:val="en-US" w:eastAsia="zh-CN"/>
         </w:rPr>
-        <w:t> Dataset</w:t>
+        <w:t/>
       </w:r>
     </w:p>
     <w:p>
@@ -889,7 +889,7 @@
             </w14:solidFill>
           </w14:textFill>
         </w:rPr>
-        <w:t>ToPoStrawberry-RGBD</w:t>
+        <w:t>TopoStrawberry-RGBD dataset</w:t>
       </w:r>
       <w:r>
         <w:rPr>
@@ -928,7 +928,7 @@
             </w14:solidFill>
           </w14:textFill>
         </w:rPr>
-        <w:t> dataset</w:t>
+        <w:t/>
       </w:r>
       <w:r>
         <w:rPr>
@@ -1101,7 +1101,7 @@
             </w14:solidFill>
           </w14:textFill>
         </w:rPr>
-        <w:t>ToPoStrawberry-RGBD</w:t>
+        <w:t>TopoStrawberry-RGBD dataset</w:t>
       </w:r>
       <w:r>
         <w:rPr>
@@ -1140,7 +1140,7 @@
             </w14:solidFill>
           </w14:textFill>
         </w:rPr>
-        <w:t xml:space="preserve"> dataset </w:t>
+        <w:t xml:space="preserve"> </w:t>
       </w:r>
       <w:r>
         <w:rPr>
@@ -1217,7 +1217,7 @@
             </w14:solidFill>
           </w14:textFill>
         </w:rPr>
-        <w:t>
+        <w:t xml:space="preserve">
 </w:t>
       </w:r>
       <w:r>
@@ -1237,7 +1237,7 @@
             </w14:solidFill>
           </w14:textFill>
         </w:rPr>
-        <w:t>
+        <w:t xml:space="preserve">
 </w:t>
       </w:r>
       <w:r>
@@ -1278,7 +1278,7 @@
             </w14:solidFill>
           </w14:textFill>
         </w:rPr>
-        <w:t>
+        <w:t xml:space="preserve">
 </w:t>
       </w:r>
     </w:p>
@@ -1495,7 +1495,7 @@
           <w:szCs w:val="24"/>
           <w:lang w:val="en-US" w:eastAsia="zh-CN"/>
         </w:rPr>
-        <w:t>ToPoStrawberry-RGBD</w:t>
+        <w:t>TopoStrawberry-RGBD dataset</w:t>
       </w:r>
       <w:r>
         <w:rPr>
@@ -1512,7 +1512,7 @@
           <w:szCs w:val="24"/>
           <w:lang w:val="en-US" w:eastAsia="zh-CN"/>
         </w:rPr>
-        <w:t> dataset</w:t>
+        <w:t/>
       </w:r>
       <w:r>
         <w:rPr>
@@ -2397,7 +2397,7 @@
         <w:sz w:val="16"/>
         <w:lang w:val="en-US" w:eastAsia="zh-CN"/>
       </w:rPr>
-      <w:t>ToPoStrawberry-RGBD</w:t>
+      <w:t>TopoStrawberry-RGBD</w:t>
     </w:r>
     <w:r>
       <w:rPr>

</xml_diff>